<commit_message>
Build the cover letter's docx, and gate every letter's PDF against it
The cover letter's .docx was generated by hand once and was never part of
build_all.sh, so it went stale the moment the letter changed. The PDF sent the
reader to the Zenodo DOI while the Word file still sent them to the GitHub
repository. Nothing in the build noticed, because nothing was looking at it.

make_docx.py now builds cover_letter.docx alongside the manuscript companions,
so it cannot fall behind the .tex again.

check_letter_parity.py compares every letter in paper/ that ships as both PDF
and docx, sentence by sentence, taking the sentences from the .tex so neither
renderer defines the truth and squashing to alphanumerics so hyphenation,
kerning and injected page numbers are not read as differences. Verified against
the exact drift that occurred -- a docx rebuilt from the pre-Zenodo letter is
caught and the offending sentence named -- and against a missing docx, which
exits 2 rather than passing.
</commit_message>
<xml_diff>
--- a/paper/cover_letter.docx
+++ b/paper/cover_letter.docx
@@ -75,7 +75,7 @@
         <w:pStyle w:val="BodyText"/>
       </w:pPr>
       <w:r>
-        <w:t xml:space="preserve">The reproducibility archive is available at:</w:t>
+        <w:t xml:space="preserve">The reproducibility archive is available on Zenodo:</w:t>
       </w:r>
       <w:r>
         <w:br/>
@@ -85,7 +85,7 @@
           <w:rPr>
             <w:rStyle w:val="Hyperlink"/>
           </w:rPr>
-          <w:t xml:space="preserve">https://github.com/samirrc2/ai-foundation-model-aml-false-positives</w:t>
+          <w:t xml:space="preserve">https://doi.org/10.5281/zenodo.23424852</w:t>
         </w:r>
       </w:hyperlink>
     </w:p>

</xml_diff>